<commit_message>
Audit RFQ v2: contact gabriel@nexonai.ro, quote comparison workbook
Co-Authored-By: Claude Sonnet 5.5 <noreply@anthropic.com>
Claude-Session: https://claude.ai/code/session_011DEBbpPzzheAYqv2omaHb3
</commit_message>
<xml_diff>
--- a/unpruuf/handover/AUDIT_ANTWORT_DOCISIA_VAZDUH_2026-10-28_RO.docx
+++ b/unpruuf/handover/AUDIT_ANTWORT_DOCISIA_VAZDUH_2026-10-28_RO.docx
@@ -33,7 +33,7 @@
         <w:t>De la:</w:t>
       </w:r>
       <w:r>
-        <w:t xml:space="preserve"> NexonAI Consulting SRL, Alba Iulia, Gabriel Hategan, unpruuf@nexonai.ro</w:t>
+        <w:t xml:space="preserve"> NexonAI Consulting SRL, Alba Iulia, Gabriel Hategan, gabriel@nexonai.ro</w:t>
       </w:r>
     </w:p>
     <w:p>
@@ -531,7 +531,7 @@
     </w:p>
     <w:p>
       <w:r>
-        <w:t>Vă rugăm să ne trimiteți răspunsul și propunerea revizuită în cel mult 10 zile calendaristice. Întrebările pot fi trimise la unpruuf@nexonai.ro.</w:t>
+        <w:t>Vă rugăm să ne trimiteți răspunsul și propunerea revizuită în cel mult 10 zile calendaristice. Întrebările pot fi trimise la gabriel@nexonai.ro.</w:t>
       </w:r>
     </w:p>
     <w:p>
@@ -551,7 +551,7 @@
     </w:p>
     <w:p>
       <w:r>
-        <w:t>unpruuf@nexonai.ro</w:t>
+        <w:t>gabriel@nexonai.ro</w:t>
       </w:r>
     </w:p>
     <w:p>

</xml_diff>